<commit_message>
add: notify to email
</commit_message>
<xml_diff>
--- a/Property_Custodian_System_Documentation_backup.docx
+++ b/Property_Custodian_System_Documentation_backup.docx
@@ -117,12 +117,6 @@
       </w:r>
     </w:p>
     <w:p>
-      <w:pPr/>
-      <w:r>
-        <w:t>2.   Installation</w:t>
-      </w:r>
-    </w:p>
-    <w:p>
       <w:pPr>
         <w:spacing w:after="60"/>
         <w:ind w:left="0"/>
@@ -133,7 +127,7 @@
           <w:b/>
           <w:sz w:val="22"/>
         </w:rPr>
-        <w:t>3.   Getting Started</w:t>
+        <w:t>2.   Getting Started</w:t>
       </w:r>
     </w:p>
     <w:p>
@@ -146,7 +140,7 @@
           <w:rFonts w:ascii="Calibri" w:hAnsi="Calibri"/>
           <w:sz w:val="22"/>
         </w:rPr>
-        <w:t>3.1   Logging In</w:t>
+        <w:t>2.1   Logging In</w:t>
       </w:r>
     </w:p>
     <w:p>
@@ -159,7 +153,7 @@
           <w:rFonts w:ascii="Calibri" w:hAnsi="Calibri"/>
           <w:sz w:val="22"/>
         </w:rPr>
-        <w:t>3.2   First-Time Password Change</w:t>
+        <w:t>2.2   First-Time Password Change</w:t>
       </w:r>
     </w:p>
     <w:p>
@@ -172,7 +166,7 @@
           <w:rFonts w:ascii="Calibri" w:hAnsi="Calibri"/>
           <w:sz w:val="22"/>
         </w:rPr>
-        <w:t>3.3   Understanding the Interface</w:t>
+        <w:t>2.3   Understanding the Interface</w:t>
       </w:r>
     </w:p>
     <w:p>
@@ -186,7 +180,7 @@
           <w:b/>
           <w:sz w:val="22"/>
         </w:rPr>
-        <w:t>4.   Custodian Guide</w:t>
+        <w:t>3.   Custodian Guide</w:t>
       </w:r>
     </w:p>
     <w:p>
@@ -199,7 +193,7 @@
           <w:rFonts w:ascii="Calibri" w:hAnsi="Calibri"/>
           <w:sz w:val="22"/>
         </w:rPr>
-        <w:t>4.1   Dashboard</w:t>
+        <w:t>3.1   Dashboard</w:t>
       </w:r>
     </w:p>
     <w:p>
@@ -212,7 +206,7 @@
           <w:rFonts w:ascii="Calibri" w:hAnsi="Calibri"/>
           <w:sz w:val="22"/>
         </w:rPr>
-        <w:t>4.2   Asset Management</w:t>
+        <w:t>3.2   Asset Management</w:t>
       </w:r>
     </w:p>
     <w:p>
@@ -225,7 +219,7 @@
           <w:rFonts w:ascii="Calibri" w:hAnsi="Calibri"/>
           <w:sz w:val="22"/>
         </w:rPr>
-        <w:t>4.3   Managing Borrow Requests</w:t>
+        <w:t>3.3   Managing Borrow Requests</w:t>
       </w:r>
     </w:p>
     <w:p>
@@ -238,7 +232,7 @@
           <w:rFonts w:ascii="Calibri" w:hAnsi="Calibri"/>
           <w:sz w:val="22"/>
         </w:rPr>
-        <w:t>4.4   Managing Returns</w:t>
+        <w:t>3.4   Managing Returns</w:t>
       </w:r>
     </w:p>
     <w:p>
@@ -251,7 +245,7 @@
           <w:rFonts w:ascii="Calibri" w:hAnsi="Calibri"/>
           <w:sz w:val="22"/>
         </w:rPr>
-        <w:t>4.5   Employee Management</w:t>
+        <w:t>3.5   Employee Management</w:t>
       </w:r>
     </w:p>
     <w:p>
@@ -264,7 +258,7 @@
           <w:rFonts w:ascii="Calibri" w:hAnsi="Calibri"/>
           <w:sz w:val="22"/>
         </w:rPr>
-        <w:t>4.6   Custodian Management</w:t>
+        <w:t>3.6   Custodian Management</w:t>
       </w:r>
     </w:p>
     <w:p>
@@ -277,7 +271,7 @@
           <w:rFonts w:ascii="Calibri" w:hAnsi="Calibri"/>
           <w:sz w:val="22"/>
         </w:rPr>
-        <w:t>4.7   Audit Trail</w:t>
+        <w:t>3.7   Audit Trail</w:t>
       </w:r>
     </w:p>
     <w:p>
@@ -290,7 +284,7 @@
           <w:rFonts w:ascii="Calibri" w:hAnsi="Calibri"/>
           <w:sz w:val="22"/>
         </w:rPr>
-        <w:t>4.8   Reports &amp; Analytics</w:t>
+        <w:t>3.8   Reports &amp; Analytics</w:t>
       </w:r>
     </w:p>
     <w:p>
@@ -304,7 +298,7 @@
           <w:b/>
           <w:sz w:val="22"/>
         </w:rPr>
-        <w:t>5.   Employee Guide</w:t>
+        <w:t>4.   Employee Guide</w:t>
       </w:r>
     </w:p>
     <w:p>
@@ -317,7 +311,7 @@
           <w:rFonts w:ascii="Calibri" w:hAnsi="Calibri"/>
           <w:sz w:val="22"/>
         </w:rPr>
-        <w:t>5.1   Dashboard</w:t>
+        <w:t>4.1   Dashboard</w:t>
       </w:r>
     </w:p>
     <w:p>
@@ -330,7 +324,7 @@
           <w:rFonts w:ascii="Calibri" w:hAnsi="Calibri"/>
           <w:sz w:val="22"/>
         </w:rPr>
-        <w:t>5.2   Browsing &amp; Requesting Assets</w:t>
+        <w:t>4.2   Browsing &amp; Requesting Assets</w:t>
       </w:r>
     </w:p>
     <w:p>
@@ -343,7 +337,7 @@
           <w:rFonts w:ascii="Calibri" w:hAnsi="Calibri"/>
           <w:sz w:val="22"/>
         </w:rPr>
-        <w:t>5.3   Managing Current Borrows</w:t>
+        <w:t>4.3   Managing Current Borrows</w:t>
       </w:r>
     </w:p>
     <w:p>
@@ -356,7 +350,7 @@
           <w:rFonts w:ascii="Calibri" w:hAnsi="Calibri"/>
           <w:sz w:val="22"/>
         </w:rPr>
-        <w:t>5.4   Borrow History</w:t>
+        <w:t>4.4   Borrow History</w:t>
       </w:r>
     </w:p>
     <w:p>
@@ -370,7 +364,7 @@
           <w:b/>
           <w:sz w:val="22"/>
         </w:rPr>
-        <w:t>6.   Notifications</w:t>
+        <w:t>5.   Notifications</w:t>
       </w:r>
     </w:p>
     <w:p>
@@ -384,7 +378,7 @@
           <w:b/>
           <w:sz w:val="22"/>
         </w:rPr>
-        <w:t>7.   Settings &amp; Account</w:t>
+        <w:t>6.   Settings &amp; Account</w:t>
       </w:r>
     </w:p>
     <w:p>
@@ -398,7 +392,7 @@
           <w:b/>
           <w:sz w:val="22"/>
         </w:rPr>
-        <w:t>8.   Frequently Asked Questions</w:t>
+        <w:t>7.   Frequently Asked Questions</w:t>
       </w:r>
     </w:p>
     <w:p>
@@ -944,243 +938,6 @@
       </w:tr>
     </w:tbl>
     <w:p>
-      <w:pPr/>
-      <w:r>
-        <w:t>The system is built with the following technologies:</w:t>
-      </w:r>
-    </w:p>
-    <w:p>
-      <w:pPr>
-        <w:pStyle w:val="ListBullet"/>
-      </w:pPr>
-      <w:r>
-        <w:t>Backend</w:t>
-      </w:r>
-    </w:p>
-    <w:p>
-      <w:pPr>
-        <w:pStyle w:val="ListBullet"/>
-      </w:pPr>
-      <w:r>
-        <w:t>Laravel 13 — PHP web framework</w:t>
-      </w:r>
-    </w:p>
-    <w:p>
-      <w:pPr>
-        <w:pStyle w:val="ListBullet"/>
-      </w:pPr>
-      <w:r>
-        <w:t>PHP 8.3 — Server-side scripting language</w:t>
-      </w:r>
-    </w:p>
-    <w:p>
-      <w:pPr>
-        <w:pStyle w:val="ListBullet"/>
-      </w:pPr>
-      <w:r>
-        <w:t>Inertia.js — Server-side rendering bridge between Laravel and React</w:t>
-      </w:r>
-    </w:p>
-    <w:p>
-      <w:pPr>
-        <w:pStyle w:val="ListBullet"/>
-      </w:pPr>
-      <w:r>
-        <w:t>Laravel Fortify — Authentication and account management</w:t>
-      </w:r>
-    </w:p>
-    <w:p>
-      <w:pPr>
-        <w:pStyle w:val="ListBullet"/>
-      </w:pPr>
-      <w:r>
-        <w:t>Laravel Wayfinder — Type-safe route generation for frontend</w:t>
-      </w:r>
-    </w:p>
-    <w:p>
-      <w:pPr>
-        <w:pStyle w:val="ListBullet"/>
-      </w:pPr>
-      <w:r>
-        <w:t>Laravel DomPDF — PDF report generation</w:t>
-      </w:r>
-    </w:p>
-    <w:p>
-      <w:pPr/>
-    </w:p>
-    <w:p>
-      <w:pPr>
-        <w:pStyle w:val="ListBullet"/>
-      </w:pPr>
-      <w:r>
-        <w:t>Frontend</w:t>
-      </w:r>
-    </w:p>
-    <w:p>
-      <w:pPr>
-        <w:pStyle w:val="ListBullet"/>
-      </w:pPr>
-      <w:r>
-        <w:t>React 19 — UI library</w:t>
-      </w:r>
-    </w:p>
-    <w:p>
-      <w:pPr>
-        <w:pStyle w:val="ListBullet"/>
-      </w:pPr>
-      <w:r>
-        <w:t>TypeScript — Type-safe JavaScript</w:t>
-      </w:r>
-    </w:p>
-    <w:p>
-      <w:pPr>
-        <w:pStyle w:val="ListBullet"/>
-      </w:pPr>
-      <w:r>
-        <w:t>Vite 8 — Build tool and development server</w:t>
-      </w:r>
-    </w:p>
-    <w:p>
-      <w:pPr>
-        <w:pStyle w:val="ListBullet"/>
-      </w:pPr>
-      <w:r>
-        <w:t>Inertia.js React adapter — Seamless server-client navigation</w:t>
-      </w:r>
-    </w:p>
-    <w:p>
-      <w:pPr/>
-    </w:p>
-    <w:p>
-      <w:pPr>
-        <w:pStyle w:val="ListBullet"/>
-      </w:pPr>
-      <w:r>
-        <w:t>UI Components</w:t>
-      </w:r>
-    </w:p>
-    <w:p>
-      <w:pPr>
-        <w:pStyle w:val="ListBullet"/>
-      </w:pPr>
-      <w:r>
-        <w:t>shadcn/ui — Component library built on Radix UI primitives</w:t>
-      </w:r>
-    </w:p>
-    <w:p>
-      <w:pPr>
-        <w:pStyle w:val="ListBullet"/>
-      </w:pPr>
-      <w:r>
-        <w:t>Tailwind CSS v4 — Utility-first CSS framework</w:t>
-      </w:r>
-    </w:p>
-    <w:p>
-      <w:pPr>
-        <w:pStyle w:val="ListBullet"/>
-      </w:pPr>
-      <w:r>
-        <w:t>Framer Motion — Animation library</w:t>
-      </w:r>
-    </w:p>
-    <w:p>
-      <w:pPr>
-        <w:pStyle w:val="ListBullet"/>
-      </w:pPr>
-      <w:r>
-        <w:t>Lucide React — Icon library</w:t>
-      </w:r>
-    </w:p>
-    <w:p>
-      <w:pPr/>
-    </w:p>
-    <w:p>
-      <w:pPr>
-        <w:pStyle w:val="ListBullet"/>
-      </w:pPr>
-      <w:r>
-        <w:t>Forms &amp; Validation</w:t>
-      </w:r>
-    </w:p>
-    <w:p>
-      <w:pPr>
-        <w:pStyle w:val="ListBullet"/>
-      </w:pPr>
-      <w:r>
-        <w:t>React Hook Form — Form state management</w:t>
-      </w:r>
-    </w:p>
-    <w:p>
-      <w:pPr>
-        <w:pStyle w:val="ListBullet"/>
-      </w:pPr>
-      <w:r>
-        <w:t>Zod — Schema validation</w:t>
-      </w:r>
-    </w:p>
-    <w:p>
-      <w:pPr/>
-    </w:p>
-    <w:p>
-      <w:pPr>
-        <w:pStyle w:val="ListBullet"/>
-      </w:pPr>
-      <w:r>
-        <w:t>Data &amp; Charts</w:t>
-      </w:r>
-    </w:p>
-    <w:p>
-      <w:pPr>
-        <w:pStyle w:val="ListBullet"/>
-      </w:pPr>
-      <w:r>
-        <w:t>Recharts — Charting library for analytics dashboards</w:t>
-      </w:r>
-    </w:p>
-    <w:p>
-      <w:pPr>
-        <w:pStyle w:val="ListBullet"/>
-      </w:pPr>
-      <w:r>
-        <w:t>date-fns — Date manipulation library</w:t>
-      </w:r>
-    </w:p>
-    <w:p>
-      <w:pPr/>
-    </w:p>
-    <w:p>
-      <w:pPr>
-        <w:pStyle w:val="ListBullet"/>
-      </w:pPr>
-      <w:r>
-        <w:t>Other</w:t>
-      </w:r>
-    </w:p>
-    <w:p>
-      <w:pPr>
-        <w:pStyle w:val="ListBullet"/>
-      </w:pPr>
-      <w:r>
-        <w:t>Sonner — Toast notifications</w:t>
-      </w:r>
-    </w:p>
-    <w:p>
-      <w:pPr>
-        <w:pStyle w:val="ListBullet"/>
-      </w:pPr>
-      <w:r>
-        <w:t>Passkeys (WebAuthn) — Passwordless authentication</w:t>
-      </w:r>
-    </w:p>
-    <w:p>
-      <w:pPr>
-        <w:pStyle w:val="ListBullet"/>
-      </w:pPr>
-      <w:r>
-        <w:t>Pest PHP — Testing framework</w:t>
-      </w:r>
-    </w:p>
-    <w:p>
       <w:r>
         <w:br w:type="page"/>
       </w:r>
@@ -1190,180 +947,10 @@
         <w:pStyle w:val="Heading1"/>
       </w:pPr>
       <w:r>
-        <w:t>2. Installation</w:t>
-      </w:r>
-    </w:p>
-    <w:p>
-      <w:pPr/>
-      <w:r>
-        <w:t>Follow these steps to set up the Property Custodian System on your local machine.</w:t>
-      </w:r>
-    </w:p>
-    <w:p>
-      <w:pPr/>
-    </w:p>
-    <w:p>
-      <w:pPr/>
-      <w:r>
-        <w:rPr>
-          <w:b/>
-        </w:rPr>
-        <w:t>1. Clone the repository from GitHub</w:t>
-      </w:r>
-    </w:p>
-    <w:p>
-      <w:pPr/>
-      <w:r>
-        <w:t>Clone the repository</w:t>
-      </w:r>
-    </w:p>
-    <w:p>
-      <w:pPr/>
-      <w:r>
-        <w:t>git clone https://github.com/coreDevAnchor/property-custodian-system.git</w:t>
-      </w:r>
-    </w:p>
-    <w:p>
-      <w:pPr/>
-      <w:r>
-        <w:t>cd property-custodian-system</w:t>
-      </w:r>
-    </w:p>
-    <w:p>
-      <w:pPr/>
-    </w:p>
-    <w:p>
-      <w:pPr/>
-      <w:r>
-        <w:rPr>
-          <w:b/>
-        </w:rPr>
-        <w:t>2. Install PHP dependencies with Composer</w:t>
-      </w:r>
-    </w:p>
-    <w:p>
-      <w:pPr/>
-      <w:r>
-        <w:t>Install dependencies</w:t>
-      </w:r>
-    </w:p>
-    <w:p>
-      <w:pPr/>
-      <w:r>
-        <w:t>composer install</w:t>
-      </w:r>
-    </w:p>
-    <w:p>
-      <w:pPr/>
-      <w:r>
-        <w:t>npm install</w:t>
-      </w:r>
-    </w:p>
-    <w:p>
-      <w:pPr/>
-    </w:p>
-    <w:p>
-      <w:pPr/>
-      <w:r>
-        <w:rPr>
-          <w:b/>
-        </w:rPr>
-        <w:t>3. Install JavaScript dependencies with npm</w:t>
-      </w:r>
-    </w:p>
-    <w:p>
-      <w:pPr/>
-    </w:p>
-    <w:p>
-      <w:pPr/>
-      <w:r>
-        <w:rPr>
-          <w:b/>
-        </w:rPr>
-        <w:t>4. Configure your environment file</w:t>
-      </w:r>
-    </w:p>
-    <w:p>
-      <w:pPr/>
-      <w:r>
-        <w:t>Configure environment</w:t>
-      </w:r>
-    </w:p>
-    <w:p>
-      <w:pPr/>
-      <w:r>
-        <w:t>cp .env.example .env</w:t>
-      </w:r>
-    </w:p>
-    <w:p>
-      <w:pPr/>
-      <w:r>
-        <w:t>php artisan key:generate</w:t>
-      </w:r>
-    </w:p>
-    <w:p>
-      <w:pPr/>
-    </w:p>
-    <w:p>
-      <w:pPr/>
-      <w:r>
-        <w:rPr>
-          <w:b/>
-        </w:rPr>
-        <w:t>5. Run database migrations</w:t>
-      </w:r>
-    </w:p>
-    <w:p>
-      <w:pPr/>
-      <w:r>
-        <w:t>Run migrations and seeders</w:t>
-      </w:r>
-    </w:p>
-    <w:p>
-      <w:pPr/>
-      <w:r>
-        <w:t>php artisan migrate --seed</w:t>
-      </w:r>
-    </w:p>
-    <w:p>
-      <w:pPr/>
-    </w:p>
-    <w:p>
-      <w:pPr/>
-      <w:r>
-        <w:rPr>
-          <w:b/>
-        </w:rPr>
-        <w:t>6. Start the development servers</w:t>
-      </w:r>
-    </w:p>
-    <w:p>
-      <w:pPr/>
-      <w:r>
-        <w:t>Start development servers</w:t>
-      </w:r>
-    </w:p>
-    <w:p>
-      <w:pPr/>
-      <w:r>
-        <w:t>php artisan serve</w:t>
-      </w:r>
-    </w:p>
-    <w:p>
-      <w:pPr/>
-      <w:r>
-        <w:t>npm run dev</w:t>
-      </w:r>
-    </w:p>
-    <w:p>
-      <w:pPr>
-        <w:pStyle w:val="Heading1"/>
-      </w:pPr>
-      <w:r>
         <w:rPr>
           <w:color w:val="2E4057"/>
         </w:rPr>
-        <w:t>3. Getting Started</w:t>
+        <w:t>2. Getting Started</w:t>
       </w:r>
     </w:p>
     <w:p>
@@ -1374,7 +961,7 @@
         <w:rPr>
           <w:color w:val="2E4057"/>
         </w:rPr>
-        <w:t>3.1 Logging In</w:t>
+        <w:t>2.1 Logging In</w:t>
       </w:r>
     </w:p>
     <w:p>
@@ -1526,7 +1113,7 @@
         <w:rPr>
           <w:color w:val="2E4057"/>
         </w:rPr>
-        <w:t>3.2 First-Time Password Change</w:t>
+        <w:t>2.2 First-Time Password Change</w:t>
       </w:r>
     </w:p>
     <w:p>
@@ -1708,7 +1295,7 @@
         <w:rPr>
           <w:color w:val="2E4057"/>
         </w:rPr>
-        <w:t>3.3 Understanding the Interface</w:t>
+        <w:t>2.3 Understanding the Interface</w:t>
       </w:r>
     </w:p>
     <w:p>
@@ -2351,7 +1938,7 @@
         <w:rPr>
           <w:color w:val="2E4057"/>
         </w:rPr>
-        <w:t>4. Custodian Guide</w:t>
+        <w:t>3. Custodian Guide</w:t>
       </w:r>
     </w:p>
     <w:p>
@@ -2374,7 +1961,7 @@
         <w:rPr>
           <w:color w:val="2E4057"/>
         </w:rPr>
-        <w:t>4.1 Dashboard</w:t>
+        <w:t>3.1 Dashboard</w:t>
       </w:r>
     </w:p>
     <w:p>
@@ -2776,7 +2363,7 @@
         <w:rPr>
           <w:color w:val="2E4057"/>
         </w:rPr>
-        <w:t>4.2 Asset Management</w:t>
+        <w:t>3.2 Asset Management</w:t>
       </w:r>
     </w:p>
     <w:p>
@@ -4154,7 +3741,7 @@
         <w:rPr>
           <w:color w:val="2E4057"/>
         </w:rPr>
-        <w:t>4.3 Managing Borrow Requests</w:t>
+        <w:t>3.3 Managing Borrow Requests</w:t>
       </w:r>
     </w:p>
     <w:p>
@@ -4653,7 +4240,7 @@
         <w:rPr>
           <w:color w:val="2E4057"/>
         </w:rPr>
-        <w:t>4.4 Managing Returns</w:t>
+        <w:t>3.4 Managing Returns</w:t>
       </w:r>
     </w:p>
     <w:p>
@@ -5087,7 +4674,7 @@
         <w:rPr>
           <w:color w:val="2E4057"/>
         </w:rPr>
-        <w:t>4.5 Employee Management</w:t>
+        <w:t>3.5 Employee Management</w:t>
       </w:r>
     </w:p>
     <w:p>
@@ -5594,7 +5181,7 @@
         <w:rPr>
           <w:color w:val="2E4057"/>
         </w:rPr>
-        <w:t>4.6 Custodian Management</w:t>
+        <w:t>3.6 Custodian Management</w:t>
       </w:r>
     </w:p>
     <w:p>
@@ -5671,7 +5258,7 @@
         <w:rPr>
           <w:color w:val="2E4057"/>
         </w:rPr>
-        <w:t>4.7 Audit Trail</w:t>
+        <w:t>3.7 Audit Trail</w:t>
       </w:r>
     </w:p>
     <w:p>
@@ -5927,7 +5514,7 @@
         <w:rPr>
           <w:color w:val="2E4057"/>
         </w:rPr>
-        <w:t>4.8 Reports &amp; Analytics</w:t>
+        <w:t>3.8 Reports &amp; Analytics</w:t>
       </w:r>
     </w:p>
     <w:p>
@@ -6613,7 +6200,7 @@
         <w:rPr>
           <w:color w:val="2E4057"/>
         </w:rPr>
-        <w:t>5. Employee Guide</w:t>
+        <w:t>4. Employee Guide</w:t>
       </w:r>
     </w:p>
     <w:p>
@@ -6636,7 +6223,7 @@
         <w:rPr>
           <w:color w:val="2E4057"/>
         </w:rPr>
-        <w:t>5.1 Employee Dashboard</w:t>
+        <w:t>4.1 Employee Dashboard</w:t>
       </w:r>
     </w:p>
     <w:p>
@@ -7125,7 +6712,7 @@
         <w:rPr>
           <w:color w:val="2E4057"/>
         </w:rPr>
-        <w:t>5.2 Browsing &amp; Requesting Assets</w:t>
+        <w:t>4.2 Browsing &amp; Requesting Assets</w:t>
       </w:r>
     </w:p>
     <w:p>
@@ -7415,7 +7002,7 @@
         <w:rPr>
           <w:color w:val="2E4057"/>
         </w:rPr>
-        <w:t>5.3 Managing Your Current Borrows</w:t>
+        <w:t>4.3 Managing Your Current Borrows</w:t>
       </w:r>
     </w:p>
     <w:p>
@@ -8029,7 +7616,7 @@
         <w:rPr>
           <w:color w:val="2E4057"/>
         </w:rPr>
-        <w:t>5.4 Borrow History</w:t>
+        <w:t>4.4 Borrow History</w:t>
       </w:r>
     </w:p>
     <w:p>
@@ -8277,7 +7864,7 @@
         <w:rPr>
           <w:color w:val="2E4057"/>
         </w:rPr>
-        <w:t>6. Notifications</w:t>
+        <w:t>5. Notifications</w:t>
       </w:r>
     </w:p>
     <w:p>
@@ -9030,7 +8617,7 @@
         <w:rPr>
           <w:color w:val="2E4057"/>
         </w:rPr>
-        <w:t>7. Settings &amp; Account</w:t>
+        <w:t>6. Settings &amp; Account</w:t>
       </w:r>
     </w:p>
     <w:p>
@@ -9462,7 +9049,7 @@
         <w:rPr>
           <w:color w:val="2E4057"/>
         </w:rPr>
-        <w:t>8. Frequently Asked Questions</w:t>
+        <w:t>7. Frequently Asked Questions</w:t>
       </w:r>
     </w:p>
     <w:p>

</xml_diff>